<commit_message>
v1.0.0 — AutoCoder Studio: refactor completo a arquitectura one-shot con HITL blindado
Este commit marca la primera publicación en GitHub del proyecto,
migrando del motor iterativo legacy (MAX_ITER/ReAct loop) a una
arquitectura one-shot por aprobación humana.

Cambios principales:
- Nuevos modulos core/: command_runner, extensions_manager,
  native_dialog, provider_manager, session_manager,
  workspace_context (separacion de responsabilidades)
- Refactor de app.py: sistema de proveedores multi-LLM
  (Ollama/OpenAI/Anthropic), deteccion de modo Lectura vs
  Propuesta, human-in-the-loop estricto con diffs y aprobacion
- Sistema RAG local con ChromaDB + embeddings Ollama
- Persistencia atomica en toda la capa de datos
- Suite de tests unitarios (12 tests, seguridad + atomicidad)
- Defensa anti-prompt-injection en system prompt
- Nuevo .gitignore con exclusion de bloqueos de Office (~$*)
- Documentacion completa de auditoria (auditoria-completa.md)
</commit_message>
<xml_diff>
--- a/documentacion/pruebasdebbugprogramadorautonomo.docx
+++ b/documentacion/pruebasdebbugprogramadorautonomo.docx
@@ -2581,6 +2581,223 @@
       <w:r>
         <w:t xml:space="preserve"> EXITOSO.</w:t>
       </w:r>
+      <w:r>
+        <w:br/>
+      </w:r>
+    </w:p>
+    <w:p>
+      <w:pPr>
+        <w:ind w:left="720"/>
+      </w:pPr>
+      <w:r>
+        <w:lastRenderedPageBreak/>
+        <w:t>Test 5: Persistencia del Objetivo y Gestión de Contexto</w:t>
+      </w:r>
+    </w:p>
+    <w:p>
+      <w:pPr>
+        <w:ind w:left="720"/>
+      </w:pPr>
+    </w:p>
+    <w:p>
+      <w:pPr>
+        <w:ind w:left="720"/>
+      </w:pPr>
+      <w:r>
+        <w:t>Resultado Real El modelo devolvió TERMINADO: de manera inmediata (junto con una respuesta inválida en JSON), ignorando por completo las tres instrucciones adicionales que mandaste antes de que descartaras el archivo.</w:t>
+      </w:r>
+    </w:p>
+    <w:p>
+      <w:pPr>
+        <w:ind w:left="720"/>
+      </w:pPr>
+    </w:p>
+    <w:p>
+      <w:pPr>
+        <w:ind w:left="720"/>
+      </w:pPr>
+      <w:r>
+        <w:t xml:space="preserve">Diagnóstico Dos problemas coordinados: 1. El Agente Fantasma: </w:t>
+      </w:r>
+      <w:proofErr w:type="spellStart"/>
+      <w:r>
+        <w:t>Qwen</w:t>
+      </w:r>
+      <w:proofErr w:type="spellEnd"/>
+      <w:r>
+        <w:t xml:space="preserve"> 14B ignoró las interrupciones intermedias y se apuró en lanzar TERMINADO, usando el descarte como excusa para finalizar la tarea entera, perdiendo así la persistencia del objetivo. 2. Error de JSON Inicial: La primera respuesta falló el </w:t>
+      </w:r>
+      <w:proofErr w:type="spellStart"/>
+      <w:r>
+        <w:t>parseo</w:t>
+      </w:r>
+      <w:proofErr w:type="spellEnd"/>
+      <w:r>
+        <w:t>, lo que entorpeció el primer paso real del flujo.</w:t>
+      </w:r>
+    </w:p>
+    <w:p>
+      <w:pPr>
+        <w:ind w:left="720"/>
+      </w:pPr>
+    </w:p>
+    <w:p>
+      <w:pPr>
+        <w:ind w:left="720"/>
+      </w:pPr>
+      <w:r>
+        <w:t xml:space="preserve">Estado: </w:t>
+      </w:r>
+      <w:r>
+        <w:rPr>
+          <w:rFonts w:ascii="Segoe UI Emoji" w:hAnsi="Segoe UI Emoji" w:cs="Segoe UI Emoji"/>
+        </w:rPr>
+        <w:t>❌</w:t>
+      </w:r>
+      <w:r>
+        <w:t xml:space="preserve"> Fallido.</w:t>
+      </w:r>
+    </w:p>
+    <w:p>
+      <w:pPr>
+        <w:ind w:left="720"/>
+      </w:pPr>
+    </w:p>
+    <w:p>
+      <w:pPr>
+        <w:ind w:left="720"/>
+      </w:pPr>
+      <w:r>
+        <w:t xml:space="preserve">Prueba 5 fase 2 </w:t>
+      </w:r>
+    </w:p>
+    <w:p>
+      <w:pPr>
+        <w:ind w:left="720"/>
+      </w:pPr>
+      <w:r>
+        <w:t>Caso documentable: Interrupción Humana durante la iteración</w:t>
+      </w:r>
+    </w:p>
+    <w:p>
+      <w:pPr>
+        <w:ind w:left="720"/>
+      </w:pPr>
+      <w:r>
+        <w:t>Bug observado: El usuario escribe un mensaje mientras el agente espera una confirmación de escritura. El sistema ignora el mensaje nuevo y sigue con la tarea vieja.</w:t>
+      </w:r>
+    </w:p>
+    <w:p>
+      <w:pPr>
+        <w:ind w:left="720"/>
+      </w:pPr>
+      <w:r>
+        <w:t>Solución implementada: Detector de interrupciones en app.py. Si el usuario escribe y </w:t>
+      </w:r>
+      <w:proofErr w:type="spellStart"/>
+      <w:r>
+        <w:t>loop_activo</w:t>
+      </w:r>
+      <w:proofErr w:type="spellEnd"/>
+      <w:r>
+        <w:t> está ocupado con </w:t>
+      </w:r>
+      <w:proofErr w:type="spellStart"/>
+      <w:r>
+        <w:t>prompt_pendiente</w:t>
+      </w:r>
+      <w:proofErr w:type="spellEnd"/>
+      <w:r>
+        <w:t> o </w:t>
+      </w:r>
+      <w:proofErr w:type="spellStart"/>
+      <w:r>
+        <w:t>escritura_pendiente</w:t>
+      </w:r>
+      <w:proofErr w:type="spellEnd"/>
+      <w:r>
+        <w:t>, aparecen tres botones:</w:t>
+      </w:r>
+    </w:p>
+    <w:p>
+      <w:pPr>
+        <w:numPr>
+          <w:ilvl w:val="0"/>
+          <w:numId w:val="15"/>
+        </w:numPr>
+      </w:pPr>
+      <w:r>
+        <w:rPr>
+          <w:rFonts w:ascii="Segoe UI Emoji" w:hAnsi="Segoe UI Emoji" w:cs="Segoe UI Emoji"/>
+        </w:rPr>
+        <w:t>🔄</w:t>
+      </w:r>
+      <w:r>
+        <w:t xml:space="preserve"> Replantear: Cancela todo lo que estaba haciendo y arranca con el nuevo mensaje.</w:t>
+      </w:r>
+    </w:p>
+    <w:p>
+      <w:pPr>
+        <w:numPr>
+          <w:ilvl w:val="0"/>
+          <w:numId w:val="15"/>
+        </w:numPr>
+      </w:pPr>
+      <w:r>
+        <w:rPr>
+          <w:rFonts w:ascii="Segoe UI Symbol" w:hAnsi="Segoe UI Symbol" w:cs="Segoe UI Symbol"/>
+        </w:rPr>
+        <w:t>✍</w:t>
+      </w:r>
+      <w:r>
+        <w:t>️ Cancelar y replantear: Limpia la cola de tareas pendientes; reserva historial y comienza de nuevo.</w:t>
+      </w:r>
+    </w:p>
+    <w:p>
+      <w:pPr>
+        <w:numPr>
+          <w:ilvl w:val="0"/>
+          <w:numId w:val="15"/>
+        </w:numPr>
+      </w:pPr>
+      <w:r>
+        <w:rPr>
+          <w:rFonts w:ascii="Segoe UI Symbol" w:hAnsi="Segoe UI Symbol" w:cs="Segoe UI Symbol"/>
+        </w:rPr>
+        <w:t>➡</w:t>
+      </w:r>
+      <w:r>
+        <w:t>️ Ignorar y continuar: Descarta el mensaje nuevo y sigue con la tarea.</w:t>
+      </w:r>
+    </w:p>
+    <w:p>
+      <w:pPr>
+        <w:ind w:left="720"/>
+      </w:pPr>
+      <w:r>
+        <w:t>De esta forma, la filosofía "Human-in-</w:t>
+      </w:r>
+      <w:proofErr w:type="spellStart"/>
+      <w:r>
+        <w:t>the</w:t>
+      </w:r>
+      <w:proofErr w:type="spellEnd"/>
+      <w:r>
+        <w:t>-</w:t>
+      </w:r>
+      <w:proofErr w:type="spellStart"/>
+      <w:r>
+        <w:t>Loop</w:t>
+      </w:r>
+      <w:proofErr w:type="spellEnd"/>
+      <w:r>
+        <w:t>" queda blindada: el sistema no puede tragarse un mensaje humano bajo ninguna circunstancia.</w:t>
+      </w:r>
+    </w:p>
+    <w:p>
+      <w:pPr>
+        <w:ind w:left="720"/>
+      </w:pPr>
     </w:p>
     <w:p>
       <w:pPr>
@@ -3420,6 +3637,155 @@
     </w:lvl>
   </w:abstractNum>
   <w:abstractNum w:abstractNumId="6" w15:restartNumberingAfterBreak="0">
+    <w:nsid w:val="2F394AAD"/>
+    <w:multiLevelType w:val="multilevel"/>
+    <w:tmpl w:val="2FD6B334"/>
+    <w:lvl w:ilvl="0">
+      <w:start w:val="1"/>
+      <w:numFmt w:val="bullet"/>
+      <w:lvlText w:val=""/>
+      <w:lvlJc w:val="left"/>
+      <w:pPr>
+        <w:tabs>
+          <w:tab w:val="num" w:pos="720"/>
+        </w:tabs>
+        <w:ind w:left="720" w:hanging="360"/>
+      </w:pPr>
+      <w:rPr>
+        <w:rFonts w:ascii="Symbol" w:hAnsi="Symbol" w:hint="default"/>
+        <w:sz w:val="20"/>
+      </w:rPr>
+    </w:lvl>
+    <w:lvl w:ilvl="1" w:tentative="1">
+      <w:start w:val="1"/>
+      <w:numFmt w:val="bullet"/>
+      <w:lvlText w:val=""/>
+      <w:lvlJc w:val="left"/>
+      <w:pPr>
+        <w:tabs>
+          <w:tab w:val="num" w:pos="1440"/>
+        </w:tabs>
+        <w:ind w:left="1440" w:hanging="360"/>
+      </w:pPr>
+      <w:rPr>
+        <w:rFonts w:ascii="Symbol" w:hAnsi="Symbol" w:hint="default"/>
+        <w:sz w:val="20"/>
+      </w:rPr>
+    </w:lvl>
+    <w:lvl w:ilvl="2" w:tentative="1">
+      <w:start w:val="1"/>
+      <w:numFmt w:val="bullet"/>
+      <w:lvlText w:val=""/>
+      <w:lvlJc w:val="left"/>
+      <w:pPr>
+        <w:tabs>
+          <w:tab w:val="num" w:pos="2160"/>
+        </w:tabs>
+        <w:ind w:left="2160" w:hanging="360"/>
+      </w:pPr>
+      <w:rPr>
+        <w:rFonts w:ascii="Symbol" w:hAnsi="Symbol" w:hint="default"/>
+        <w:sz w:val="20"/>
+      </w:rPr>
+    </w:lvl>
+    <w:lvl w:ilvl="3" w:tentative="1">
+      <w:start w:val="1"/>
+      <w:numFmt w:val="bullet"/>
+      <w:lvlText w:val=""/>
+      <w:lvlJc w:val="left"/>
+      <w:pPr>
+        <w:tabs>
+          <w:tab w:val="num" w:pos="2880"/>
+        </w:tabs>
+        <w:ind w:left="2880" w:hanging="360"/>
+      </w:pPr>
+      <w:rPr>
+        <w:rFonts w:ascii="Symbol" w:hAnsi="Symbol" w:hint="default"/>
+        <w:sz w:val="20"/>
+      </w:rPr>
+    </w:lvl>
+    <w:lvl w:ilvl="4" w:tentative="1">
+      <w:start w:val="1"/>
+      <w:numFmt w:val="bullet"/>
+      <w:lvlText w:val=""/>
+      <w:lvlJc w:val="left"/>
+      <w:pPr>
+        <w:tabs>
+          <w:tab w:val="num" w:pos="3600"/>
+        </w:tabs>
+        <w:ind w:left="3600" w:hanging="360"/>
+      </w:pPr>
+      <w:rPr>
+        <w:rFonts w:ascii="Symbol" w:hAnsi="Symbol" w:hint="default"/>
+        <w:sz w:val="20"/>
+      </w:rPr>
+    </w:lvl>
+    <w:lvl w:ilvl="5" w:tentative="1">
+      <w:start w:val="1"/>
+      <w:numFmt w:val="bullet"/>
+      <w:lvlText w:val=""/>
+      <w:lvlJc w:val="left"/>
+      <w:pPr>
+        <w:tabs>
+          <w:tab w:val="num" w:pos="4320"/>
+        </w:tabs>
+        <w:ind w:left="4320" w:hanging="360"/>
+      </w:pPr>
+      <w:rPr>
+        <w:rFonts w:ascii="Symbol" w:hAnsi="Symbol" w:hint="default"/>
+        <w:sz w:val="20"/>
+      </w:rPr>
+    </w:lvl>
+    <w:lvl w:ilvl="6" w:tentative="1">
+      <w:start w:val="1"/>
+      <w:numFmt w:val="bullet"/>
+      <w:lvlText w:val=""/>
+      <w:lvlJc w:val="left"/>
+      <w:pPr>
+        <w:tabs>
+          <w:tab w:val="num" w:pos="5040"/>
+        </w:tabs>
+        <w:ind w:left="5040" w:hanging="360"/>
+      </w:pPr>
+      <w:rPr>
+        <w:rFonts w:ascii="Symbol" w:hAnsi="Symbol" w:hint="default"/>
+        <w:sz w:val="20"/>
+      </w:rPr>
+    </w:lvl>
+    <w:lvl w:ilvl="7" w:tentative="1">
+      <w:start w:val="1"/>
+      <w:numFmt w:val="bullet"/>
+      <w:lvlText w:val=""/>
+      <w:lvlJc w:val="left"/>
+      <w:pPr>
+        <w:tabs>
+          <w:tab w:val="num" w:pos="5760"/>
+        </w:tabs>
+        <w:ind w:left="5760" w:hanging="360"/>
+      </w:pPr>
+      <w:rPr>
+        <w:rFonts w:ascii="Symbol" w:hAnsi="Symbol" w:hint="default"/>
+        <w:sz w:val="20"/>
+      </w:rPr>
+    </w:lvl>
+    <w:lvl w:ilvl="8" w:tentative="1">
+      <w:start w:val="1"/>
+      <w:numFmt w:val="bullet"/>
+      <w:lvlText w:val=""/>
+      <w:lvlJc w:val="left"/>
+      <w:pPr>
+        <w:tabs>
+          <w:tab w:val="num" w:pos="6480"/>
+        </w:tabs>
+        <w:ind w:left="6480" w:hanging="360"/>
+      </w:pPr>
+      <w:rPr>
+        <w:rFonts w:ascii="Symbol" w:hAnsi="Symbol" w:hint="default"/>
+        <w:sz w:val="20"/>
+      </w:rPr>
+    </w:lvl>
+  </w:abstractNum>
+  <w:abstractNum w:abstractNumId="7" w15:restartNumberingAfterBreak="0">
     <w:nsid w:val="36452E12"/>
     <w:multiLevelType w:val="multilevel"/>
     <w:tmpl w:val="30929A4A"/>
@@ -3568,7 +3934,7 @@
       </w:rPr>
     </w:lvl>
   </w:abstractNum>
-  <w:abstractNum w:abstractNumId="7" w15:restartNumberingAfterBreak="0">
+  <w:abstractNum w:abstractNumId="8" w15:restartNumberingAfterBreak="0">
     <w:nsid w:val="3E0873FB"/>
     <w:multiLevelType w:val="multilevel"/>
     <w:tmpl w:val="73D2CCB6"/>
@@ -3717,7 +4083,7 @@
       </w:rPr>
     </w:lvl>
   </w:abstractNum>
-  <w:abstractNum w:abstractNumId="8" w15:restartNumberingAfterBreak="0">
+  <w:abstractNum w:abstractNumId="9" w15:restartNumberingAfterBreak="0">
     <w:nsid w:val="40D02224"/>
     <w:multiLevelType w:val="hybridMultilevel"/>
     <w:tmpl w:val="E64ED616"/>
@@ -3803,7 +4169,7 @@
       </w:pPr>
     </w:lvl>
   </w:abstractNum>
-  <w:abstractNum w:abstractNumId="9" w15:restartNumberingAfterBreak="0">
+  <w:abstractNum w:abstractNumId="10" w15:restartNumberingAfterBreak="0">
     <w:nsid w:val="568F73A8"/>
     <w:multiLevelType w:val="multilevel"/>
     <w:tmpl w:val="81228FCC"/>
@@ -3952,7 +4318,7 @@
       </w:rPr>
     </w:lvl>
   </w:abstractNum>
-  <w:abstractNum w:abstractNumId="10" w15:restartNumberingAfterBreak="0">
+  <w:abstractNum w:abstractNumId="11" w15:restartNumberingAfterBreak="0">
     <w:nsid w:val="59111D15"/>
     <w:multiLevelType w:val="multilevel"/>
     <w:tmpl w:val="E07EDA26"/>
@@ -4101,7 +4467,7 @@
       </w:rPr>
     </w:lvl>
   </w:abstractNum>
-  <w:abstractNum w:abstractNumId="11" w15:restartNumberingAfterBreak="0">
+  <w:abstractNum w:abstractNumId="12" w15:restartNumberingAfterBreak="0">
     <w:nsid w:val="5A6058F8"/>
     <w:multiLevelType w:val="multilevel"/>
     <w:tmpl w:val="E80C9618"/>
@@ -4250,7 +4616,7 @@
       </w:rPr>
     </w:lvl>
   </w:abstractNum>
-  <w:abstractNum w:abstractNumId="12" w15:restartNumberingAfterBreak="0">
+  <w:abstractNum w:abstractNumId="13" w15:restartNumberingAfterBreak="0">
     <w:nsid w:val="636D0A10"/>
     <w:multiLevelType w:val="multilevel"/>
     <w:tmpl w:val="62DC100A"/>
@@ -4399,7 +4765,7 @@
       </w:rPr>
     </w:lvl>
   </w:abstractNum>
-  <w:abstractNum w:abstractNumId="13" w15:restartNumberingAfterBreak="0">
+  <w:abstractNum w:abstractNumId="14" w15:restartNumberingAfterBreak="0">
     <w:nsid w:val="7158185F"/>
     <w:multiLevelType w:val="hybridMultilevel"/>
     <w:tmpl w:val="31F4B1DE"/>
@@ -4489,10 +4855,10 @@
     <w:abstractNumId w:val="0"/>
   </w:num>
   <w:num w:numId="2" w16cid:durableId="333067473">
-    <w:abstractNumId w:val="13"/>
+    <w:abstractNumId w:val="14"/>
   </w:num>
   <w:num w:numId="3" w16cid:durableId="1464540983">
-    <w:abstractNumId w:val="8"/>
+    <w:abstractNumId w:val="9"/>
   </w:num>
   <w:num w:numId="4" w16cid:durableId="1127624097">
     <w:abstractNumId w:val="5"/>
@@ -4507,25 +4873,28 @@
     <w:abstractNumId w:val="3"/>
   </w:num>
   <w:num w:numId="8" w16cid:durableId="1938823798">
-    <w:abstractNumId w:val="9"/>
+    <w:abstractNumId w:val="10"/>
   </w:num>
   <w:num w:numId="9" w16cid:durableId="1547376216">
-    <w:abstractNumId w:val="11"/>
+    <w:abstractNumId w:val="12"/>
   </w:num>
   <w:num w:numId="10" w16cid:durableId="77480213">
-    <w:abstractNumId w:val="7"/>
+    <w:abstractNumId w:val="8"/>
   </w:num>
   <w:num w:numId="11" w16cid:durableId="1367178300">
-    <w:abstractNumId w:val="12"/>
+    <w:abstractNumId w:val="13"/>
   </w:num>
   <w:num w:numId="12" w16cid:durableId="1161502789">
-    <w:abstractNumId w:val="6"/>
+    <w:abstractNumId w:val="7"/>
   </w:num>
   <w:num w:numId="13" w16cid:durableId="229121728">
     <w:abstractNumId w:val="4"/>
   </w:num>
   <w:num w:numId="14" w16cid:durableId="877162861">
-    <w:abstractNumId w:val="10"/>
+    <w:abstractNumId w:val="11"/>
+  </w:num>
+  <w:num w:numId="15" w16cid:durableId="742265664">
+    <w:abstractNumId w:val="6"/>
   </w:num>
 </w:numbering>
 </file>

</xml_diff>